<commit_message>
Add table loops, display fields, and GitHub Pages for examples.
Ship repeating-table bind/preview, BASE_URL-safe template assets, and an Actions workflow that publishes native/custom demos.

Co-authored-by: Cursor <cursoragent@cursor.com>
</commit_message>
<xml_diff>
--- a/examples/custom-ui/public/templates/采购合同.docx
+++ b/examples/custom-ui/public/templates/采购合同.docx
@@ -827,7 +827,7 @@
                 <w:sz w:val="20"/>
                 <w:szCs w:val="20"/>
               </w:rPr>
-              <w:t xml:space="preserve">1</w:t>
+              <w:t xml:space="preserve">{{items.$index}}</w:t>
             </w:r>
           </w:p>
         </w:tc>
@@ -853,7 +853,7 @@
                 <w:sz w:val="20"/>
                 <w:szCs w:val="20"/>
               </w:rPr>
-              <w:t xml:space="preserve">{{goods}}</w:t>
+              <w:t xml:space="preserve">{{items.name}}</w:t>
             </w:r>
           </w:p>
         </w:tc>
@@ -879,7 +879,7 @@
                 <w:sz w:val="20"/>
                 <w:szCs w:val="20"/>
               </w:rPr>
-              <w:t xml:space="preserve">{{spec}}</w:t>
+              <w:t xml:space="preserve">{{items.spec}}</w:t>
             </w:r>
           </w:p>
         </w:tc>
@@ -905,7 +905,7 @@
                 <w:sz w:val="20"/>
                 <w:szCs w:val="20"/>
               </w:rPr>
-              <w:t xml:space="preserve">{{qty:number}}</w:t>
+              <w:t xml:space="preserve">{{items.qty:number}}</w:t>
             </w:r>
           </w:p>
         </w:tc>
@@ -931,7 +931,7 @@
                 <w:sz w:val="20"/>
                 <w:szCs w:val="20"/>
               </w:rPr>
-              <w:t xml:space="preserve">{{unitPrice:number}}</w:t>
+              <w:t xml:space="preserve">{{items.unitPrice:number}}</w:t>
             </w:r>
           </w:p>
         </w:tc>
@@ -1566,6 +1566,63 @@
                 <w:szCs w:val="20"/>
               </w:rPr>
               <w:t xml:space="preserve">{{note:textarea}}</w:t>
+            </w:r>
+          </w:p>
+        </w:tc>
+      </w:tr>
+      <w:tr>
+        <w:tc>
+          <w:tcPr>
+            <w:tcW w:w="2600" w:type="dxa"/>
+            <w:shd w:val="clear" w:color="auto" w:fill="E8EEF5"/>
+            <w:tcMar>
+              <w:top w:w="60"/>
+              <w:left w:w="100"/>
+              <w:bottom w:w="60"/>
+              <w:right w:w="100"/>
+            </w:tcMar>
+          </w:tcPr>
+          <w:p>
+            <w:pPr>
+              <w:jc w:val="left"/>
+              <w:spacing w:before="40" w:after="40" w:line="360" w:lineRule="auto"/>
+            </w:pPr>
+            <w:r>
+              <w:rPr>
+                <w:rFonts w:ascii="宋体" w:hAnsi="宋体" w:eastAsia="宋体"/>
+                <w:b/>
+                <w:bCs/>
+                <w:sz w:val="20"/>
+                <w:szCs w:val="20"/>
+                <w:color w:val="1B3A5C"/>
+              </w:rPr>
+              <w:t xml:space="preserve">填写日</w:t>
+            </w:r>
+          </w:p>
+        </w:tc>
+        <w:tc>
+          <w:tcPr>
+            <w:tcW w:w="6440" w:type="dxa"/>
+            <w:shd w:val="clear" w:color="auto" w:fill="FFFFFF"/>
+            <w:tcMar>
+              <w:top w:w="60"/>
+              <w:left w:w="100"/>
+              <w:bottom w:w="60"/>
+              <w:right w:w="100"/>
+            </w:tcMar>
+          </w:tcPr>
+          <w:p>
+            <w:pPr>
+              <w:jc w:val="left"/>
+              <w:spacing w:before="40" w:after="40" w:line="360" w:lineRule="auto"/>
+            </w:pPr>
+            <w:r>
+              <w:rPr>
+                <w:rFonts w:ascii="宋体" w:hAnsi="宋体" w:eastAsia="宋体"/>
+                <w:sz w:val="20"/>
+                <w:szCs w:val="20"/>
+              </w:rPr>
+              <w:t xml:space="preserve">{{filledAt:display}}</w:t>
             </w:r>
           </w:p>
         </w:tc>

</xml_diff>